<commit_message>
Cleanup script folder: archive old versions, unify build scripts
</commit_message>
<xml_diff>
--- a/output/DigComp3_acronyms_nl.docx
+++ b/output/DigComp3_acronyms_nl.docx
@@ -8,6 +8,9 @@
       </w:pPr>
       <w:r>
         <w:rPr>
+          <w:rFonts w:ascii="Arial" w:hAnsi="Arial"/>
+          <w:b w:val="0"/>
+          <w:i w:val="0"/>
           <w:color w:val="1F4E78"/>
           <w:sz w:val="36"/>
         </w:rPr>
@@ -17,28 +20,27 @@
     <w:tbl>
       <w:tblPr>
         <w:tblW w:type="auto" w:w="0"/>
-        <w:tblLayout w:type="fixed"/>
         <w:tblLook w:firstColumn="1" w:firstRow="1" w:lastColumn="0" w:lastRow="0" w:noHBand="0" w:noVBand="1" w:val="04A0"/>
+        <w:tblW w:w="5000" w:type="pct"/>
         <w:tblBorders>
           <w:left w:val="nil"/>
           <w:right w:val="nil"/>
           <w:insideV w:val="nil"/>
-          <w:top w:val="single" w:sz="4" w:space="0" w:color="D9D9D9"/>
-          <w:bottom w:val="single" w:sz="4" w:space="0" w:color="D9D9D9"/>
-          <w:insideH w:val="single" w:sz="4" w:space="0" w:color="D9D9D9"/>
+          <w:top w:val="single" w:sz="2" w:color="D9D9D9"/>
+          <w:bottom w:val="single" w:sz="2" w:color="D9D9D9"/>
+          <w:insideH w:val="single" w:sz="2" w:color="D9D9D9"/>
         </w:tblBorders>
       </w:tblPr>
       <w:tblGrid>
-        <w:gridCol w:w="1247"/>
-        <w:gridCol w:w="3685"/>
-        <w:gridCol w:w="1247"/>
-        <w:gridCol w:w="3685"/>
+        <w:gridCol w:w="2160"/>
+        <w:gridCol w:w="2160"/>
+        <w:gridCol w:w="2160"/>
+        <w:gridCol w:w="2160"/>
       </w:tblGrid>
       <w:tr>
         <w:tc>
           <w:tcPr>
-            <w:tcW w:type="dxa" w:w="1247"/>
-            <w:vAlign w:val="top"/>
+            <w:tcW w:type="dxa" w:w="2160"/>
             <w:shd w:fill="1F4E78"/>
           </w:tcPr>
           <w:p>
@@ -46,8 +48,9 @@
               <w:rPr>
                 <w:rFonts w:ascii="Arial" w:hAnsi="Arial"/>
                 <w:b/>
+                <w:i w:val="0"/>
                 <w:color w:val="FFFFFF"/>
-                <w:sz w:val="20"/>
+                <w:sz w:val="18"/>
               </w:rPr>
               <w:t>ACRONIEM</w:t>
             </w:r>
@@ -55,8 +58,7 @@
         </w:tc>
         <w:tc>
           <w:tcPr>
-            <w:tcW w:type="dxa" w:w="3685"/>
-            <w:vAlign w:val="top"/>
+            <w:tcW w:type="dxa" w:w="2160"/>
             <w:shd w:fill="1F4E78"/>
           </w:tcPr>
           <w:p>
@@ -64,8 +66,9 @@
               <w:rPr>
                 <w:rFonts w:ascii="Arial" w:hAnsi="Arial"/>
                 <w:b/>
+                <w:i w:val="0"/>
                 <w:color w:val="FFFFFF"/>
-                <w:sz w:val="20"/>
+                <w:sz w:val="18"/>
               </w:rPr>
               <w:t>BETEKENIS</w:t>
             </w:r>
@@ -73,8 +76,7 @@
         </w:tc>
         <w:tc>
           <w:tcPr>
-            <w:tcW w:type="dxa" w:w="1247"/>
-            <w:vAlign w:val="top"/>
+            <w:tcW w:type="dxa" w:w="2160"/>
             <w:shd w:fill="1F4E78"/>
           </w:tcPr>
           <w:p>
@@ -82,8 +84,9 @@
               <w:rPr>
                 <w:rFonts w:ascii="Arial" w:hAnsi="Arial"/>
                 <w:b/>
+                <w:i w:val="0"/>
                 <w:color w:val="FFFFFF"/>
-                <w:sz w:val="20"/>
+                <w:sz w:val="18"/>
               </w:rPr>
               <w:t>ACRONIEM</w:t>
             </w:r>
@@ -91,8 +94,7 @@
         </w:tc>
         <w:tc>
           <w:tcPr>
-            <w:tcW w:type="dxa" w:w="3685"/>
-            <w:vAlign w:val="top"/>
+            <w:tcW w:type="dxa" w:w="2160"/>
             <w:shd w:fill="1F4E78"/>
           </w:tcPr>
           <w:p>
@@ -100,8 +102,9 @@
               <w:rPr>
                 <w:rFonts w:ascii="Arial" w:hAnsi="Arial"/>
                 <w:b/>
+                <w:i w:val="0"/>
                 <w:color w:val="FFFFFF"/>
-                <w:sz w:val="20"/>
+                <w:sz w:val="18"/>
               </w:rPr>
               <w:t>BETEKENIS</w:t>
             </w:r>
@@ -111,14 +114,14 @@
       <w:tr>
         <w:tc>
           <w:tcPr>
-            <w:tcW w:type="dxa" w:w="1247"/>
-            <w:vAlign w:val="top"/>
+            <w:tcW w:type="dxa" w:w="2160"/>
           </w:tcPr>
           <w:p>
             <w:r>
               <w:rPr>
                 <w:rFonts w:ascii="Arial" w:hAnsi="Arial"/>
                 <w:b/>
+                <w:i w:val="0"/>
                 <w:color w:val="000000"/>
                 <w:sz w:val="18"/>
               </w:rPr>
@@ -128,31 +131,31 @@
         </w:tc>
         <w:tc>
           <w:tcPr>
-            <w:tcW w:type="dxa" w:w="3685"/>
-            <w:vAlign w:val="top"/>
+            <w:tcW w:type="dxa" w:w="2160"/>
           </w:tcPr>
           <w:p>
             <w:r>
               <w:rPr>
                 <w:rFonts w:ascii="Arial" w:hAnsi="Arial"/>
                 <w:b w:val="0"/>
+                <w:i w:val="0"/>
                 <w:color w:val="000000"/>
                 <w:sz w:val="18"/>
               </w:rPr>
-              <w:t>Directoraat-generaal Landbouw en Plattelandsontwikkeling</w:t>
+              <w:t>Directorate-General for Agriculture and Rural Development</w:t>
             </w:r>
           </w:p>
         </w:tc>
         <w:tc>
           <w:tcPr>
-            <w:tcW w:type="dxa" w:w="1247"/>
-            <w:vAlign w:val="top"/>
+            <w:tcW w:type="dxa" w:w="2160"/>
           </w:tcPr>
           <w:p>
             <w:r>
               <w:rPr>
                 <w:rFonts w:ascii="Arial" w:hAnsi="Arial"/>
                 <w:b/>
+                <w:i w:val="0"/>
                 <w:color w:val="000000"/>
                 <w:sz w:val="18"/>
               </w:rPr>
@@ -162,18 +165,18 @@
         </w:tc>
         <w:tc>
           <w:tcPr>
-            <w:tcW w:type="dxa" w:w="3685"/>
-            <w:vAlign w:val="top"/>
+            <w:tcW w:type="dxa" w:w="2160"/>
           </w:tcPr>
           <w:p>
             <w:r>
               <w:rPr>
                 <w:rFonts w:ascii="Arial" w:hAnsi="Arial"/>
                 <w:b w:val="0"/>
+                <w:i w:val="0"/>
                 <w:color w:val="000000"/>
                 <w:sz w:val="18"/>
               </w:rPr>
-              <w:t>Internationale Telecommunicatie-unie</w:t>
+              <w:t>International Telecommunications Union</w:t>
             </w:r>
           </w:p>
         </w:tc>
@@ -181,14 +184,14 @@
       <w:tr>
         <w:tc>
           <w:tcPr>
-            <w:tcW w:type="dxa" w:w="1247"/>
-            <w:vAlign w:val="top"/>
+            <w:tcW w:type="dxa" w:w="2160"/>
           </w:tcPr>
           <w:p>
             <w:r>
               <w:rPr>
                 <w:rFonts w:ascii="Arial" w:hAnsi="Arial"/>
                 <w:b/>
+                <w:i w:val="0"/>
                 <w:color w:val="000000"/>
                 <w:sz w:val="18"/>
               </w:rPr>
@@ -198,14 +201,14 @@
         </w:tc>
         <w:tc>
           <w:tcPr>
-            <w:tcW w:type="dxa" w:w="3685"/>
-            <w:vAlign w:val="top"/>
+            <w:tcW w:type="dxa" w:w="2160"/>
           </w:tcPr>
           <w:p>
             <w:r>
               <w:rPr>
                 <w:rFonts w:ascii="Arial" w:hAnsi="Arial"/>
                 <w:b w:val="0"/>
+                <w:i w:val="0"/>
                 <w:color w:val="000000"/>
                 <w:sz w:val="18"/>
               </w:rPr>
@@ -215,14 +218,14 @@
         </w:tc>
         <w:tc>
           <w:tcPr>
-            <w:tcW w:type="dxa" w:w="1247"/>
-            <w:vAlign w:val="top"/>
+            <w:tcW w:type="dxa" w:w="2160"/>
           </w:tcPr>
           <w:p>
             <w:r>
               <w:rPr>
                 <w:rFonts w:ascii="Arial" w:hAnsi="Arial"/>
                 <w:b/>
+                <w:i w:val="0"/>
                 <w:color w:val="000000"/>
                 <w:sz w:val="18"/>
               </w:rPr>
@@ -232,18 +235,18 @@
         </w:tc>
         <w:tc>
           <w:tcPr>
-            <w:tcW w:type="dxa" w:w="3685"/>
-            <w:vAlign w:val="top"/>
+            <w:tcW w:type="dxa" w:w="2160"/>
           </w:tcPr>
           <w:p>
             <w:r>
               <w:rPr>
                 <w:rFonts w:ascii="Arial" w:hAnsi="Arial"/>
                 <w:b w:val="0"/>
+                <w:i w:val="0"/>
                 <w:color w:val="000000"/>
                 <w:sz w:val="18"/>
               </w:rPr>
-              <w:t>Gemeenschappelijk Centrum voor onderzoek</w:t>
+              <w:t>Joint Research Centre</w:t>
             </w:r>
           </w:p>
         </w:tc>
@@ -251,14 +254,14 @@
       <w:tr>
         <w:tc>
           <w:tcPr>
-            <w:tcW w:type="dxa" w:w="1247"/>
-            <w:vAlign w:val="top"/>
+            <w:tcW w:type="dxa" w:w="2160"/>
           </w:tcPr>
           <w:p>
             <w:r>
               <w:rPr>
                 <w:rFonts w:ascii="Arial" w:hAnsi="Arial"/>
                 <w:b/>
+                <w:i w:val="0"/>
                 <w:color w:val="000000"/>
                 <w:sz w:val="18"/>
               </w:rPr>
@@ -268,31 +271,31 @@
         </w:tc>
         <w:tc>
           <w:tcPr>
-            <w:tcW w:type="dxa" w:w="3685"/>
-            <w:vAlign w:val="top"/>
+            <w:tcW w:type="dxa" w:w="2160"/>
           </w:tcPr>
           <w:p>
             <w:r>
               <w:rPr>
                 <w:rFonts w:ascii="Arial" w:hAnsi="Arial"/>
                 <w:b w:val="0"/>
+                <w:i w:val="0"/>
                 <w:color w:val="000000"/>
                 <w:sz w:val="18"/>
               </w:rPr>
-              <w:t>Augmented reality (toegevoegde realiteit)</w:t>
+              <w:t>Augmented Reality</w:t>
             </w:r>
           </w:p>
         </w:tc>
         <w:tc>
           <w:tcPr>
-            <w:tcW w:type="dxa" w:w="1247"/>
-            <w:vAlign w:val="top"/>
+            <w:tcW w:type="dxa" w:w="2160"/>
           </w:tcPr>
           <w:p>
             <w:r>
               <w:rPr>
                 <w:rFonts w:ascii="Arial" w:hAnsi="Arial"/>
                 <w:b/>
+                <w:i w:val="0"/>
                 <w:color w:val="000000"/>
                 <w:sz w:val="18"/>
               </w:rPr>
@@ -302,14 +305,14 @@
         </w:tc>
         <w:tc>
           <w:tcPr>
-            <w:tcW w:type="dxa" w:w="3685"/>
-            <w:vAlign w:val="top"/>
+            <w:tcW w:type="dxa" w:w="2160"/>
           </w:tcPr>
           <w:p>
             <w:r>
               <w:rPr>
                 <w:rFonts w:ascii="Arial" w:hAnsi="Arial"/>
                 <w:b w:val="0"/>
+                <w:i w:val="0"/>
                 <w:color w:val="000000"/>
                 <w:sz w:val="18"/>
               </w:rPr>
@@ -321,14 +324,14 @@
       <w:tr>
         <w:tc>
           <w:tcPr>
-            <w:tcW w:type="dxa" w:w="1247"/>
-            <w:vAlign w:val="top"/>
+            <w:tcW w:type="dxa" w:w="2160"/>
           </w:tcPr>
           <w:p>
             <w:r>
               <w:rPr>
                 <w:rFonts w:ascii="Arial" w:hAnsi="Arial"/>
                 <w:b/>
+                <w:i w:val="0"/>
                 <w:color w:val="000000"/>
                 <w:sz w:val="18"/>
               </w:rPr>
@@ -338,31 +341,31 @@
         </w:tc>
         <w:tc>
           <w:tcPr>
-            <w:tcW w:type="dxa" w:w="3685"/>
-            <w:vAlign w:val="top"/>
+            <w:tcW w:type="dxa" w:w="2160"/>
           </w:tcPr>
           <w:p>
             <w:r>
               <w:rPr>
                 <w:rFonts w:ascii="Arial" w:hAnsi="Arial"/>
                 <w:b w:val="0"/>
+                <w:i w:val="0"/>
                 <w:color w:val="000000"/>
                 <w:sz w:val="18"/>
               </w:rPr>
-              <w:t>Directoraat-generaal Communicatienetwerken, Inhoud en Technologie</w:t>
+              <w:t>Directorate-General for Communications Networks, Content and Technology</w:t>
             </w:r>
           </w:p>
         </w:tc>
         <w:tc>
           <w:tcPr>
-            <w:tcW w:type="dxa" w:w="1247"/>
-            <w:vAlign w:val="top"/>
+            <w:tcW w:type="dxa" w:w="2160"/>
           </w:tcPr>
           <w:p>
             <w:r>
               <w:rPr>
                 <w:rFonts w:ascii="Arial" w:hAnsi="Arial"/>
                 <w:b/>
+                <w:i w:val="0"/>
                 <w:color w:val="000000"/>
                 <w:sz w:val="18"/>
               </w:rPr>
@@ -372,18 +375,18 @@
         </w:tc>
         <w:tc>
           <w:tcPr>
-            <w:tcW w:type="dxa" w:w="3685"/>
-            <w:vAlign w:val="top"/>
+            <w:tcW w:type="dxa" w:w="2160"/>
           </w:tcPr>
           <w:p>
             <w:r>
               <w:rPr>
                 <w:rFonts w:ascii="Arial" w:hAnsi="Arial"/>
                 <w:b w:val="0"/>
+                <w:i w:val="0"/>
                 <w:color w:val="000000"/>
                 <w:sz w:val="18"/>
               </w:rPr>
-              <w:t>Mixed reality (gemengde realiteit)</w:t>
+              <w:t>Mixed Reality</w:t>
             </w:r>
           </w:p>
         </w:tc>
@@ -391,14 +394,14 @@
       <w:tr>
         <w:tc>
           <w:tcPr>
-            <w:tcW w:type="dxa" w:w="1247"/>
-            <w:vAlign w:val="top"/>
+            <w:tcW w:type="dxa" w:w="2160"/>
           </w:tcPr>
           <w:p>
             <w:r>
               <w:rPr>
                 <w:rFonts w:ascii="Arial" w:hAnsi="Arial"/>
                 <w:b/>
+                <w:i w:val="0"/>
                 <w:color w:val="000000"/>
                 <w:sz w:val="18"/>
               </w:rPr>
@@ -408,31 +411,31 @@
         </w:tc>
         <w:tc>
           <w:tcPr>
-            <w:tcW w:type="dxa" w:w="3685"/>
-            <w:vAlign w:val="top"/>
+            <w:tcW w:type="dxa" w:w="2160"/>
           </w:tcPr>
           <w:p>
             <w:r>
               <w:rPr>
                 <w:rFonts w:ascii="Arial" w:hAnsi="Arial"/>
                 <w:b w:val="0"/>
+                <w:i w:val="0"/>
                 <w:color w:val="000000"/>
                 <w:sz w:val="18"/>
               </w:rPr>
-              <w:t>Directoraat-generaal Digitale Diensten</w:t>
+              <w:t>Directorate-General for Digital Services</w:t>
             </w:r>
           </w:p>
         </w:tc>
         <w:tc>
           <w:tcPr>
-            <w:tcW w:type="dxa" w:w="1247"/>
-            <w:vAlign w:val="top"/>
+            <w:tcW w:type="dxa" w:w="2160"/>
           </w:tcPr>
           <w:p>
             <w:r>
               <w:rPr>
                 <w:rFonts w:ascii="Arial" w:hAnsi="Arial"/>
                 <w:b/>
+                <w:i w:val="0"/>
                 <w:color w:val="000000"/>
                 <w:sz w:val="18"/>
               </w:rPr>
@@ -442,18 +445,18 @@
         </w:tc>
         <w:tc>
           <w:tcPr>
-            <w:tcW w:type="dxa" w:w="3685"/>
-            <w:vAlign w:val="top"/>
+            <w:tcW w:type="dxa" w:w="2160"/>
           </w:tcPr>
           <w:p>
             <w:r>
               <w:rPr>
                 <w:rFonts w:ascii="Arial" w:hAnsi="Arial"/>
                 <w:b w:val="0"/>
+                <w:i w:val="0"/>
                 <w:color w:val="000000"/>
                 <w:sz w:val="18"/>
               </w:rPr>
-              <w:t>Nationaal kwalificatiekader</w:t>
+              <w:t>Nationaal kwalificatieraamwerk</w:t>
             </w:r>
           </w:p>
         </w:tc>
@@ -461,14 +464,14 @@
       <w:tr>
         <w:tc>
           <w:tcPr>
-            <w:tcW w:type="dxa" w:w="1247"/>
-            <w:vAlign w:val="top"/>
+            <w:tcW w:type="dxa" w:w="2160"/>
           </w:tcPr>
           <w:p>
             <w:r>
               <w:rPr>
                 <w:rFonts w:ascii="Arial" w:hAnsi="Arial"/>
                 <w:b/>
+                <w:i w:val="0"/>
                 <w:color w:val="000000"/>
                 <w:sz w:val="18"/>
               </w:rPr>
@@ -478,31 +481,31 @@
         </w:tc>
         <w:tc>
           <w:tcPr>
-            <w:tcW w:type="dxa" w:w="3685"/>
-            <w:vAlign w:val="top"/>
+            <w:tcW w:type="dxa" w:w="2160"/>
           </w:tcPr>
           <w:p>
             <w:r>
               <w:rPr>
                 <w:rFonts w:ascii="Arial" w:hAnsi="Arial"/>
                 <w:b w:val="0"/>
+                <w:i w:val="0"/>
                 <w:color w:val="000000"/>
                 <w:sz w:val="18"/>
               </w:rPr>
-              <w:t>Directoraat-generaal Onderwijs, Jongerenzaken, Sport en Cultuur</w:t>
+              <w:t>Directorate-General for Education, Youth, Sport and Culture</w:t>
             </w:r>
           </w:p>
         </w:tc>
         <w:tc>
           <w:tcPr>
-            <w:tcW w:type="dxa" w:w="1247"/>
-            <w:vAlign w:val="top"/>
+            <w:tcW w:type="dxa" w:w="2160"/>
           </w:tcPr>
           <w:p>
             <w:r>
               <w:rPr>
                 <w:rFonts w:ascii="Arial" w:hAnsi="Arial"/>
                 <w:b/>
+                <w:i w:val="0"/>
                 <w:color w:val="000000"/>
                 <w:sz w:val="18"/>
               </w:rPr>
@@ -512,18 +515,18 @@
         </w:tc>
         <w:tc>
           <w:tcPr>
-            <w:tcW w:type="dxa" w:w="3685"/>
-            <w:vAlign w:val="top"/>
+            <w:tcW w:type="dxa" w:w="2160"/>
           </w:tcPr>
           <w:p>
             <w:r>
               <w:rPr>
                 <w:rFonts w:ascii="Arial" w:hAnsi="Arial"/>
                 <w:b w:val="0"/>
+                <w:i w:val="0"/>
                 <w:color w:val="000000"/>
                 <w:sz w:val="18"/>
               </w:rPr>
-              <w:t>Organisatie voor Economische Samenwerking en Ontwikkeling (OESO)</w:t>
+              <w:t>Organisatie voor Economische Samenwerking en Ontwikkeling</w:t>
             </w:r>
           </w:p>
         </w:tc>
@@ -531,14 +534,14 @@
       <w:tr>
         <w:tc>
           <w:tcPr>
-            <w:tcW w:type="dxa" w:w="1247"/>
-            <w:vAlign w:val="top"/>
+            <w:tcW w:type="dxa" w:w="2160"/>
           </w:tcPr>
           <w:p>
             <w:r>
               <w:rPr>
                 <w:rFonts w:ascii="Arial" w:hAnsi="Arial"/>
                 <w:b/>
+                <w:i w:val="0"/>
                 <w:color w:val="000000"/>
                 <w:sz w:val="18"/>
               </w:rPr>
@@ -548,14 +551,14 @@
         </w:tc>
         <w:tc>
           <w:tcPr>
-            <w:tcW w:type="dxa" w:w="3685"/>
-            <w:vAlign w:val="top"/>
+            <w:tcW w:type="dxa" w:w="2160"/>
           </w:tcPr>
           <w:p>
             <w:r>
               <w:rPr>
                 <w:rFonts w:ascii="Arial" w:hAnsi="Arial"/>
                 <w:b w:val="0"/>
+                <w:i w:val="0"/>
                 <w:color w:val="000000"/>
                 <w:sz w:val="18"/>
               </w:rPr>
@@ -565,14 +568,14 @@
         </w:tc>
         <w:tc>
           <w:tcPr>
-            <w:tcW w:type="dxa" w:w="1247"/>
-            <w:vAlign w:val="top"/>
+            <w:tcW w:type="dxa" w:w="2160"/>
           </w:tcPr>
           <w:p>
             <w:r>
               <w:rPr>
                 <w:rFonts w:ascii="Arial" w:hAnsi="Arial"/>
                 <w:b/>
+                <w:i w:val="0"/>
                 <w:color w:val="000000"/>
                 <w:sz w:val="18"/>
               </w:rPr>
@@ -582,18 +585,18 @@
         </w:tc>
         <w:tc>
           <w:tcPr>
-            <w:tcW w:type="dxa" w:w="3685"/>
-            <w:vAlign w:val="top"/>
+            <w:tcW w:type="dxa" w:w="2160"/>
           </w:tcPr>
           <w:p>
             <w:r>
               <w:rPr>
                 <w:rFonts w:ascii="Arial" w:hAnsi="Arial"/>
                 <w:b w:val="0"/>
+                <w:i w:val="0"/>
                 <w:color w:val="000000"/>
                 <w:sz w:val="18"/>
               </w:rPr>
-              <w:t>Open leermiddelen (OER)</w:t>
+              <w:t>Open leermaterialen (OER)</w:t>
             </w:r>
           </w:p>
         </w:tc>
@@ -601,14 +604,14 @@
       <w:tr>
         <w:tc>
           <w:tcPr>
-            <w:tcW w:type="dxa" w:w="1247"/>
-            <w:vAlign w:val="top"/>
+            <w:tcW w:type="dxa" w:w="2160"/>
           </w:tcPr>
           <w:p>
             <w:r>
               <w:rPr>
                 <w:rFonts w:ascii="Arial" w:hAnsi="Arial"/>
                 <w:b/>
+                <w:i w:val="0"/>
                 <w:color w:val="000000"/>
                 <w:sz w:val="18"/>
               </w:rPr>
@@ -618,31 +621,31 @@
         </w:tc>
         <w:tc>
           <w:tcPr>
-            <w:tcW w:type="dxa" w:w="3685"/>
-            <w:vAlign w:val="top"/>
+            <w:tcW w:type="dxa" w:w="2160"/>
           </w:tcPr>
           <w:p>
             <w:r>
               <w:rPr>
                 <w:rFonts w:ascii="Arial" w:hAnsi="Arial"/>
                 <w:b w:val="0"/>
+                <w:i w:val="0"/>
                 <w:color w:val="000000"/>
                 <w:sz w:val="18"/>
               </w:rPr>
-              <w:t>Directoraat-generaal Werkgelegenheid, Sociale Zaken en Inclusie</w:t>
+              <w:t>Directorate-General for Employment, Social Affairs and Inclusion</w:t>
             </w:r>
           </w:p>
         </w:tc>
         <w:tc>
           <w:tcPr>
-            <w:tcW w:type="dxa" w:w="1247"/>
-            <w:vAlign w:val="top"/>
+            <w:tcW w:type="dxa" w:w="2160"/>
           </w:tcPr>
           <w:p>
             <w:r>
               <w:rPr>
                 <w:rFonts w:ascii="Arial" w:hAnsi="Arial"/>
                 <w:b/>
+                <w:i w:val="0"/>
                 <w:color w:val="000000"/>
                 <w:sz w:val="18"/>
               </w:rPr>
@@ -652,18 +655,18 @@
         </w:tc>
         <w:tc>
           <w:tcPr>
-            <w:tcW w:type="dxa" w:w="3685"/>
-            <w:vAlign w:val="top"/>
+            <w:tcW w:type="dxa" w:w="2160"/>
           </w:tcPr>
           <w:p>
             <w:r>
               <w:rPr>
                 <w:rFonts w:ascii="Arial" w:hAnsi="Arial"/>
                 <w:b w:val="0"/>
+                <w:i w:val="0"/>
                 <w:color w:val="000000"/>
                 <w:sz w:val="18"/>
               </w:rPr>
-              <w:t>Taskforce voor hervormingen en investeringen</w:t>
+              <w:t>Reform and Investment Task Force</w:t>
             </w:r>
           </w:p>
         </w:tc>
@@ -671,14 +674,14 @@
       <w:tr>
         <w:tc>
           <w:tcPr>
-            <w:tcW w:type="dxa" w:w="1247"/>
-            <w:vAlign w:val="top"/>
+            <w:tcW w:type="dxa" w:w="2160"/>
           </w:tcPr>
           <w:p>
             <w:r>
               <w:rPr>
                 <w:rFonts w:ascii="Arial" w:hAnsi="Arial"/>
                 <w:b/>
+                <w:i w:val="0"/>
                 <w:color w:val="000000"/>
                 <w:sz w:val="18"/>
               </w:rPr>
@@ -688,31 +691,31 @@
         </w:tc>
         <w:tc>
           <w:tcPr>
-            <w:tcW w:type="dxa" w:w="3685"/>
-            <w:vAlign w:val="top"/>
+            <w:tcW w:type="dxa" w:w="2160"/>
           </w:tcPr>
           <w:p>
             <w:r>
               <w:rPr>
                 <w:rFonts w:ascii="Arial" w:hAnsi="Arial"/>
                 <w:b w:val="0"/>
+                <w:i w:val="0"/>
                 <w:color w:val="000000"/>
                 <w:sz w:val="18"/>
               </w:rPr>
-              <w:t>Europees kwalificatiekader (EQF)</w:t>
+              <w:t>Europees kwalificatieraamwerk</w:t>
             </w:r>
           </w:p>
         </w:tc>
         <w:tc>
           <w:tcPr>
-            <w:tcW w:type="dxa" w:w="1247"/>
-            <w:vAlign w:val="top"/>
+            <w:tcW w:type="dxa" w:w="2160"/>
           </w:tcPr>
           <w:p>
             <w:r>
               <w:rPr>
                 <w:rFonts w:ascii="Arial" w:hAnsi="Arial"/>
                 <w:b/>
+                <w:i w:val="0"/>
                 <w:color w:val="000000"/>
                 <w:sz w:val="18"/>
               </w:rPr>
@@ -722,18 +725,18 @@
         </w:tc>
         <w:tc>
           <w:tcPr>
-            <w:tcW w:type="dxa" w:w="3685"/>
-            <w:vAlign w:val="top"/>
+            <w:tcW w:type="dxa" w:w="2160"/>
           </w:tcPr>
           <w:p>
             <w:r>
               <w:rPr>
                 <w:rFonts w:ascii="Arial" w:hAnsi="Arial"/>
                 <w:b w:val="0"/>
+                <w:i w:val="0"/>
                 <w:color w:val="000000"/>
                 <w:sz w:val="18"/>
               </w:rPr>
-              <w:t>De Juridische Dienst (van de Europese Commissie)</w:t>
+              <w:t>Le Service juridique (juridische dienst van de Europese Commissie)</w:t>
             </w:r>
           </w:p>
         </w:tc>
@@ -741,14 +744,14 @@
       <w:tr>
         <w:tc>
           <w:tcPr>
-            <w:tcW w:type="dxa" w:w="1247"/>
-            <w:vAlign w:val="top"/>
+            <w:tcW w:type="dxa" w:w="2160"/>
           </w:tcPr>
           <w:p>
             <w:r>
               <w:rPr>
                 <w:rFonts w:ascii="Arial" w:hAnsi="Arial"/>
                 <w:b/>
+                <w:i w:val="0"/>
                 <w:color w:val="000000"/>
                 <w:sz w:val="18"/>
               </w:rPr>
@@ -758,14 +761,14 @@
         </w:tc>
         <w:tc>
           <w:tcPr>
-            <w:tcW w:type="dxa" w:w="3685"/>
-            <w:vAlign w:val="top"/>
+            <w:tcW w:type="dxa" w:w="2160"/>
           </w:tcPr>
           <w:p>
             <w:r>
               <w:rPr>
                 <w:rFonts w:ascii="Arial" w:hAnsi="Arial"/>
                 <w:b w:val="0"/>
+                <w:i w:val="0"/>
                 <w:color w:val="000000"/>
                 <w:sz w:val="18"/>
               </w:rPr>
@@ -775,14 +778,14 @@
         </w:tc>
         <w:tc>
           <w:tcPr>
-            <w:tcW w:type="dxa" w:w="1247"/>
-            <w:vAlign w:val="top"/>
+            <w:tcW w:type="dxa" w:w="2160"/>
           </w:tcPr>
           <w:p>
             <w:r>
               <w:rPr>
                 <w:rFonts w:ascii="Arial" w:hAnsi="Arial"/>
                 <w:b/>
+                <w:i w:val="0"/>
                 <w:color w:val="000000"/>
                 <w:sz w:val="18"/>
               </w:rPr>
@@ -792,18 +795,18 @@
         </w:tc>
         <w:tc>
           <w:tcPr>
-            <w:tcW w:type="dxa" w:w="3685"/>
-            <w:vAlign w:val="top"/>
+            <w:tcW w:type="dxa" w:w="2160"/>
           </w:tcPr>
           <w:p>
             <w:r>
               <w:rPr>
                 <w:rFonts w:ascii="Arial" w:hAnsi="Arial"/>
                 <w:b w:val="0"/>
+                <w:i w:val="0"/>
                 <w:color w:val="000000"/>
                 <w:sz w:val="18"/>
               </w:rPr>
-              <w:t>Wetenschap, Technologie, Techniek en Wiskunde</w:t>
+              <w:t>Science, Technology, Engineering and Mathematics</w:t>
             </w:r>
           </w:p>
         </w:tc>
@@ -811,14 +814,14 @@
       <w:tr>
         <w:tc>
           <w:tcPr>
-            <w:tcW w:type="dxa" w:w="1247"/>
-            <w:vAlign w:val="top"/>
+            <w:tcW w:type="dxa" w:w="2160"/>
           </w:tcPr>
           <w:p>
             <w:r>
               <w:rPr>
                 <w:rFonts w:ascii="Arial" w:hAnsi="Arial"/>
                 <w:b/>
+                <w:i w:val="0"/>
                 <w:color w:val="000000"/>
                 <w:sz w:val="18"/>
               </w:rPr>
@@ -828,14 +831,14 @@
         </w:tc>
         <w:tc>
           <w:tcPr>
-            <w:tcW w:type="dxa" w:w="3685"/>
-            <w:vAlign w:val="top"/>
+            <w:tcW w:type="dxa" w:w="2160"/>
           </w:tcPr>
           <w:p>
             <w:r>
               <w:rPr>
                 <w:rFonts w:ascii="Arial" w:hAnsi="Arial"/>
                 <w:b w:val="0"/>
+                <w:i w:val="0"/>
                 <w:color w:val="000000"/>
                 <w:sz w:val="18"/>
               </w:rPr>
@@ -845,14 +848,14 @@
         </w:tc>
         <w:tc>
           <w:tcPr>
-            <w:tcW w:type="dxa" w:w="1247"/>
-            <w:vAlign w:val="top"/>
+            <w:tcW w:type="dxa" w:w="2160"/>
           </w:tcPr>
           <w:p>
             <w:r>
               <w:rPr>
                 <w:rFonts w:ascii="Arial" w:hAnsi="Arial"/>
                 <w:b/>
+                <w:i w:val="0"/>
                 <w:color w:val="000000"/>
                 <w:sz w:val="18"/>
               </w:rPr>
@@ -862,14 +865,14 @@
         </w:tc>
         <w:tc>
           <w:tcPr>
-            <w:tcW w:type="dxa" w:w="3685"/>
-            <w:vAlign w:val="top"/>
+            <w:tcW w:type="dxa" w:w="2160"/>
           </w:tcPr>
           <w:p>
             <w:r>
               <w:rPr>
                 <w:rFonts w:ascii="Arial" w:hAnsi="Arial"/>
                 <w:b w:val="0"/>
+                <w:i w:val="0"/>
                 <w:color w:val="000000"/>
                 <w:sz w:val="18"/>
               </w:rPr>
@@ -881,14 +884,14 @@
       <w:tr>
         <w:tc>
           <w:tcPr>
-            <w:tcW w:type="dxa" w:w="1247"/>
-            <w:vAlign w:val="top"/>
+            <w:tcW w:type="dxa" w:w="2160"/>
           </w:tcPr>
           <w:p>
             <w:r>
               <w:rPr>
                 <w:rFonts w:ascii="Arial" w:hAnsi="Arial"/>
                 <w:b/>
+                <w:i w:val="0"/>
                 <w:color w:val="000000"/>
                 <w:sz w:val="18"/>
               </w:rPr>
@@ -898,31 +901,31 @@
         </w:tc>
         <w:tc>
           <w:tcPr>
-            <w:tcW w:type="dxa" w:w="3685"/>
-            <w:vAlign w:val="top"/>
+            <w:tcW w:type="dxa" w:w="2160"/>
           </w:tcPr>
           <w:p>
             <w:r>
               <w:rPr>
                 <w:rFonts w:ascii="Arial" w:hAnsi="Arial"/>
                 <w:b w:val="0"/>
+                <w:i w:val="0"/>
                 <w:color w:val="000000"/>
                 <w:sz w:val="18"/>
               </w:rPr>
-              <w:t>Bureau voor intellectuele eigendom van de Europese Unie</w:t>
+              <w:t>European Union Intellectual Property Office</w:t>
             </w:r>
           </w:p>
         </w:tc>
         <w:tc>
           <w:tcPr>
-            <w:tcW w:type="dxa" w:w="1247"/>
-            <w:vAlign w:val="top"/>
+            <w:tcW w:type="dxa" w:w="2160"/>
           </w:tcPr>
           <w:p>
             <w:r>
               <w:rPr>
                 <w:rFonts w:ascii="Arial" w:hAnsi="Arial"/>
                 <w:b/>
+                <w:i w:val="0"/>
                 <w:color w:val="000000"/>
                 <w:sz w:val="18"/>
               </w:rPr>
@@ -932,18 +935,18 @@
         </w:tc>
         <w:tc>
           <w:tcPr>
-            <w:tcW w:type="dxa" w:w="3685"/>
-            <w:vAlign w:val="top"/>
+            <w:tcW w:type="dxa" w:w="2160"/>
           </w:tcPr>
           <w:p>
             <w:r>
               <w:rPr>
                 <w:rFonts w:ascii="Arial" w:hAnsi="Arial"/>
                 <w:b w:val="0"/>
+                <w:i w:val="0"/>
                 <w:color w:val="000000"/>
                 <w:sz w:val="18"/>
               </w:rPr>
-              <w:t>Organisatie der Verenigde Naties voor Onderwijs, Wetenschap en Cultuur (UNESCO)</w:t>
+              <w:t>Organisatie der Verenigde Naties voor Onderwijs, Wetenschap en Cultuur</w:t>
             </w:r>
           </w:p>
         </w:tc>
@@ -951,14 +954,14 @@
       <w:tr>
         <w:tc>
           <w:tcPr>
-            <w:tcW w:type="dxa" w:w="1247"/>
-            <w:vAlign w:val="top"/>
+            <w:tcW w:type="dxa" w:w="2160"/>
           </w:tcPr>
           <w:p>
             <w:r>
               <w:rPr>
                 <w:rFonts w:ascii="Arial" w:hAnsi="Arial"/>
                 <w:b/>
+                <w:i w:val="0"/>
                 <w:color w:val="000000"/>
                 <w:sz w:val="18"/>
               </w:rPr>
@@ -968,31 +971,31 @@
         </w:tc>
         <w:tc>
           <w:tcPr>
-            <w:tcW w:type="dxa" w:w="3685"/>
-            <w:vAlign w:val="top"/>
+            <w:tcW w:type="dxa" w:w="2160"/>
           </w:tcPr>
           <w:p>
             <w:r>
               <w:rPr>
                 <w:rFonts w:ascii="Arial" w:hAnsi="Arial"/>
                 <w:b w:val="0"/>
+                <w:i w:val="0"/>
                 <w:color w:val="000000"/>
                 <w:sz w:val="18"/>
               </w:rPr>
-              <w:t>Algemene verordening gegevensbescherming (AVG)</w:t>
+              <w:t>Algemene Verordening Gegevensbescherming</w:t>
             </w:r>
           </w:p>
         </w:tc>
         <w:tc>
           <w:tcPr>
-            <w:tcW w:type="dxa" w:w="1247"/>
-            <w:vAlign w:val="top"/>
+            <w:tcW w:type="dxa" w:w="2160"/>
           </w:tcPr>
           <w:p>
             <w:r>
               <w:rPr>
                 <w:rFonts w:ascii="Arial" w:hAnsi="Arial"/>
                 <w:b/>
+                <w:i w:val="0"/>
                 <w:color w:val="000000"/>
                 <w:sz w:val="18"/>
               </w:rPr>
@@ -1002,18 +1005,18 @@
         </w:tc>
         <w:tc>
           <w:tcPr>
-            <w:tcW w:type="dxa" w:w="3685"/>
-            <w:vAlign w:val="top"/>
+            <w:tcW w:type="dxa" w:w="2160"/>
           </w:tcPr>
           <w:p>
             <w:r>
               <w:rPr>
                 <w:rFonts w:ascii="Arial" w:hAnsi="Arial"/>
                 <w:b w:val="0"/>
+                <w:i w:val="0"/>
                 <w:color w:val="000000"/>
                 <w:sz w:val="18"/>
               </w:rPr>
-              <w:t>Beroepsonderwijs en -opleiding</w:t>
+              <w:t>Middelbaar beroepsonderwijs (mbo)</w:t>
             </w:r>
           </w:p>
         </w:tc>
@@ -1021,14 +1024,14 @@
       <w:tr>
         <w:tc>
           <w:tcPr>
-            <w:tcW w:type="dxa" w:w="1247"/>
-            <w:vAlign w:val="top"/>
+            <w:tcW w:type="dxa" w:w="2160"/>
           </w:tcPr>
           <w:p>
             <w:r>
               <w:rPr>
                 <w:rFonts w:ascii="Arial" w:hAnsi="Arial"/>
                 <w:b/>
+                <w:i w:val="0"/>
                 <w:color w:val="000000"/>
                 <w:sz w:val="18"/>
               </w:rPr>
@@ -1038,31 +1041,31 @@
         </w:tc>
         <w:tc>
           <w:tcPr>
-            <w:tcW w:type="dxa" w:w="3685"/>
-            <w:vAlign w:val="top"/>
+            <w:tcW w:type="dxa" w:w="2160"/>
           </w:tcPr>
           <w:p>
             <w:r>
               <w:rPr>
                 <w:rFonts w:ascii="Arial" w:hAnsi="Arial"/>
                 <w:b w:val="0"/>
+                <w:i w:val="0"/>
                 <w:color w:val="000000"/>
                 <w:sz w:val="18"/>
               </w:rPr>
-              <w:t>International Computer and Information Literacy Study (ICILS)</w:t>
+              <w:t>International Computer and Information Literacy Study</w:t>
             </w:r>
           </w:p>
         </w:tc>
         <w:tc>
           <w:tcPr>
-            <w:tcW w:type="dxa" w:w="1247"/>
-            <w:vAlign w:val="top"/>
+            <w:tcW w:type="dxa" w:w="2160"/>
           </w:tcPr>
           <w:p>
             <w:r>
               <w:rPr>
                 <w:rFonts w:ascii="Arial" w:hAnsi="Arial"/>
                 <w:b/>
+                <w:i w:val="0"/>
                 <w:color w:val="000000"/>
                 <w:sz w:val="18"/>
               </w:rPr>
@@ -1072,18 +1075,18 @@
         </w:tc>
         <w:tc>
           <w:tcPr>
-            <w:tcW w:type="dxa" w:w="3685"/>
-            <w:vAlign w:val="top"/>
+            <w:tcW w:type="dxa" w:w="2160"/>
           </w:tcPr>
           <w:p>
             <w:r>
               <w:rPr>
                 <w:rFonts w:ascii="Arial" w:hAnsi="Arial"/>
                 <w:b w:val="0"/>
+                <w:i w:val="0"/>
                 <w:color w:val="000000"/>
                 <w:sz w:val="18"/>
               </w:rPr>
-              <w:t>Virtual reality (virtuele realiteit)</w:t>
+              <w:t>Virtual Reality</w:t>
             </w:r>
           </w:p>
         </w:tc>
@@ -1091,14 +1094,14 @@
       <w:tr>
         <w:tc>
           <w:tcPr>
-            <w:tcW w:type="dxa" w:w="1247"/>
-            <w:vAlign w:val="top"/>
+            <w:tcW w:type="dxa" w:w="2160"/>
           </w:tcPr>
           <w:p>
             <w:r>
               <w:rPr>
                 <w:rFonts w:ascii="Arial" w:hAnsi="Arial"/>
                 <w:b/>
+                <w:i w:val="0"/>
                 <w:color w:val="000000"/>
                 <w:sz w:val="18"/>
               </w:rPr>
@@ -1108,31 +1111,31 @@
         </w:tc>
         <w:tc>
           <w:tcPr>
-            <w:tcW w:type="dxa" w:w="3685"/>
-            <w:vAlign w:val="top"/>
+            <w:tcW w:type="dxa" w:w="2160"/>
           </w:tcPr>
           <w:p>
             <w:r>
               <w:rPr>
                 <w:rFonts w:ascii="Arial" w:hAnsi="Arial"/>
                 <w:b w:val="0"/>
+                <w:i w:val="0"/>
                 <w:color w:val="000000"/>
                 <w:sz w:val="18"/>
               </w:rPr>
-              <w:t>Informatie- en communicatietechnologie (ICT)</w:t>
+              <w:t>Informatie- en communicatietechnologie</w:t>
             </w:r>
           </w:p>
         </w:tc>
         <w:tc>
           <w:tcPr>
-            <w:tcW w:type="dxa" w:w="1247"/>
-            <w:vAlign w:val="top"/>
+            <w:tcW w:type="dxa" w:w="2160"/>
           </w:tcPr>
           <w:p>
             <w:r>
               <w:rPr>
                 <w:rFonts w:ascii="Arial" w:hAnsi="Arial"/>
                 <w:b/>
+                <w:i w:val="0"/>
                 <w:color w:val="000000"/>
                 <w:sz w:val="18"/>
               </w:rPr>
@@ -1142,18 +1145,18 @@
         </w:tc>
         <w:tc>
           <w:tcPr>
-            <w:tcW w:type="dxa" w:w="3685"/>
-            <w:vAlign w:val="top"/>
+            <w:tcW w:type="dxa" w:w="2160"/>
           </w:tcPr>
           <w:p>
             <w:r>
               <w:rPr>
                 <w:rFonts w:ascii="Arial" w:hAnsi="Arial"/>
                 <w:b w:val="0"/>
+                <w:i w:val="0"/>
                 <w:color w:val="000000"/>
                 <w:sz w:val="18"/>
               </w:rPr>
-              <w:t>Extended reality (XR)</w:t>
+              <w:t>Extended Reality</w:t>
             </w:r>
           </w:p>
         </w:tc>

</xml_diff>